<commit_message>
Update final resume with boxed references section
Co-Authored-By: Claude Sonnet 4.6 <noreply@anthropic.com>
Claude-Session: https://claude.ai/code/session_01E9G8Hx9zob5G833xHGZ6Vu
</commit_message>
<xml_diff>
--- a/Matthew_McGovern_Resume_Final.docx
+++ b/Matthew_McGovern_Resume_Final.docx
@@ -532,7 +532,7 @@
     </w:p>
     <w:p>
       <w:pPr>
-        <w:spacing w:before="80"/>
+        <w:spacing w:before="80" w:after="200"/>
       </w:pPr>
       <w:r>
         <w:rPr>
@@ -541,6 +541,201 @@
         <w:t>Weightlifting  ·  Martial Arts  ·  Club Basketball (Adelphi)  ·  Traveling  ·  Learning New Languages</w:t>
       </w:r>
     </w:p>
+    <w:p>
+      <w:pPr>
+        <w:spacing w:before="200" w:after="20"/>
+        <w:pBdr>
+          <w:bottom w:val="single" w:sz="4" w:space="1" w:color="1B2A4A"/>
+        </w:pBdr>
+      </w:pPr>
+      <w:r>
+        <w:rPr>
+          <w:b/>
+          <w:color w:val="1B2A4A"/>
+          <w:sz w:val="21"/>
+        </w:rPr>
+        <w:t>REFERENCES</w:t>
+      </w:r>
+    </w:p>
+    <w:tbl>
+      <w:tblGrid>
+        <w:gridCol w:w="4320"/>
+        <w:gridCol w:w="4320"/>
+      </w:tblGrid>
+      <w:tblPr>
+        <w:tblStyle w:val="TableGrid"/>
+        <w:tblW w:type="auto" w:w="0"/>
+        <w:tblLook w:firstColumn="1" w:firstRow="1" w:lastColumn="0" w:lastRow="0" w:noHBand="0" w:noVBand="1" w:val="04A0"/>
+        <w:tblBorders>
+          <w:top w:val="single" w:sz="4" w:color="1B2A4A"/>
+          <w:left w:val="single" w:sz="4" w:color="1B2A4A"/>
+          <w:bottom w:val="single" w:sz="4" w:color="1B2A4A"/>
+          <w:right w:val="single" w:sz="4" w:color="1B2A4A"/>
+          <w:insideH w:val="single" w:sz="4" w:color="1B2A4A"/>
+          <w:insideV w:val="single" w:sz="4" w:color="1B2A4A"/>
+        </w:tblBorders>
+      </w:tblPr>
+      <w:tblGrid>
+        <w:gridCol w:w="4824"/>
+        <w:gridCol w:w="4824"/>
+      </w:tblGrid>
+      <w:tr>
+        <w:tc>
+          <w:tcPr>
+            <w:tcW w:type="dxa" w:w="4824"/>
+            <w:shd w:val="clear" w:color="auto" w:fill="EAF0F8"/>
+          </w:tcPr>
+          <w:p>
+            <w:pPr>
+              <w:spacing w:before="120" w:after="40"/>
+            </w:pPr>
+            <w:r>
+              <w:rPr>
+                <w:b/>
+                <w:color w:val="1B2A4A"/>
+                <w:sz w:val="22"/>
+              </w:rPr>
+              <w:t>Ian Rubel</w:t>
+            </w:r>
+          </w:p>
+          <w:p>
+            <w:pPr>
+              <w:spacing w:before="0" w:after="20"/>
+            </w:pPr>
+            <w:r>
+              <w:rPr>
+                <w:i/>
+                <w:sz w:val="20"/>
+              </w:rPr>
+              <w:t>Professor, Sports Management</w:t>
+            </w:r>
+          </w:p>
+          <w:p>
+            <w:pPr>
+              <w:spacing w:before="0" w:after="20"/>
+            </w:pPr>
+            <w:r>
+              <w:rPr>
+                <w:sz w:val="20"/>
+              </w:rPr>
+              <w:t>Adelphi University</w:t>
+            </w:r>
+          </w:p>
+          <w:p>
+            <w:pPr>
+              <w:spacing w:before="0" w:after="20"/>
+            </w:pPr>
+            <w:r>
+              <w:rPr>
+                <w:sz w:val="20"/>
+              </w:rPr>
+              <w:t>+1 (973) 460-0779</w:t>
+            </w:r>
+          </w:p>
+          <w:p>
+            <w:pPr>
+              <w:spacing w:before="0" w:after="20"/>
+            </w:pPr>
+            <w:r>
+              <w:rPr>
+                <w:sz w:val="20"/>
+              </w:rPr>
+              <w:t>irubel@adelphi.edu</w:t>
+            </w:r>
+          </w:p>
+          <w:p>
+            <w:pPr>
+              <w:spacing w:before="40" w:after="120"/>
+            </w:pPr>
+            <w:r>
+              <w:rPr>
+                <w:i/>
+                <w:color w:val="555555"/>
+                <w:sz w:val="19"/>
+              </w:rPr>
+              <w:t>Sports Law &amp; Labor (Spr. 2024)  ·  Sports Agency (2025)</w:t>
+            </w:r>
+          </w:p>
+        </w:tc>
+        <w:tc>
+          <w:tcPr>
+            <w:tcW w:type="dxa" w:w="4824"/>
+            <w:shd w:val="clear" w:color="auto" w:fill="EAF0F8"/>
+          </w:tcPr>
+          <w:p>
+            <w:pPr>
+              <w:spacing w:before="120" w:after="40"/>
+            </w:pPr>
+            <w:r>
+              <w:rPr>
+                <w:b/>
+                <w:color w:val="1B2A4A"/>
+                <w:sz w:val="22"/>
+              </w:rPr>
+              <w:t>Dan Bedard</w:t>
+            </w:r>
+          </w:p>
+          <w:p>
+            <w:pPr>
+              <w:spacing w:before="0" w:after="20"/>
+            </w:pPr>
+            <w:r>
+              <w:rPr>
+                <w:i/>
+                <w:sz w:val="20"/>
+              </w:rPr>
+              <w:t>Professor, Sports Management</w:t>
+            </w:r>
+          </w:p>
+          <w:p>
+            <w:pPr>
+              <w:spacing w:before="0" w:after="20"/>
+            </w:pPr>
+            <w:r>
+              <w:rPr>
+                <w:sz w:val="20"/>
+              </w:rPr>
+              <w:t>Adelphi University</w:t>
+            </w:r>
+          </w:p>
+          <w:p>
+            <w:pPr>
+              <w:spacing w:before="0" w:after="20"/>
+            </w:pPr>
+            <w:r>
+              <w:rPr>
+                <w:sz w:val="20"/>
+              </w:rPr>
+              <w:t>(631) 764-2149</w:t>
+            </w:r>
+          </w:p>
+          <w:p>
+            <w:pPr>
+              <w:spacing w:before="0" w:after="20"/>
+            </w:pPr>
+            <w:r>
+              <w:rPr>
+                <w:sz w:val="20"/>
+              </w:rPr>
+              <w:t>bedard@adelphi.edu</w:t>
+            </w:r>
+          </w:p>
+          <w:p>
+            <w:pPr>
+              <w:spacing w:before="40" w:after="120"/>
+            </w:pPr>
+            <w:r>
+              <w:rPr>
+                <w:i/>
+                <w:color w:val="555555"/>
+                <w:sz w:val="19"/>
+              </w:rPr>
+              <w:t>Aspects of Coaching (2023)  ·  Sports Facility &amp; Admin (Fall 2025)</w:t>
+            </w:r>
+          </w:p>
+        </w:tc>
+      </w:tr>
+    </w:tbl>
     <w:sectPr>
       <w:pgSz w:w="12240" w:h="15840"/>
       <w:pgMar w:top="936" w:right="1296" w:bottom="936" w:left="1296" w:header="720" w:footer="720" w:gutter="0"/>

</xml_diff>